<commit_message>
Deploying to gh-pages from @ d-morrison/rme@108ec18fb4d41a7be88caf3fbc902f6284857ee3 🚀
</commit_message>
<xml_diff>
--- a/chapters/count-regression-handout.docx
+++ b/chapters/count-regression-handout.docx
@@ -33526,7 +33526,7 @@
               <w:rPr>
                 <w:rStyle w:val="CommentTok"/>
               </w:rPr>
-              <w:t xml:space="preserve">#&gt;     hivstat + sexabuse + hplsns, data = needles, init.theta = 0.0903642555, </w:t>
+              <w:t xml:space="preserve">#&gt;     hivstat + sexabuse + hplsns, data = needles, init.theta = 0.08315440712, </w:t>
             </w:r>
             <w:r>
               <w:br/>
@@ -33562,7 +33562,7 @@
               <w:rPr>
                 <w:rStyle w:val="CommentTok"/>
               </w:rPr>
-              <w:t xml:space="preserve">#&gt;                             Estimate Std. Error z value Pr(&gt;|z|)   </w:t>
+              <w:t xml:space="preserve">#&gt;                             Estimate Std. Error z value Pr(&gt;|z|)    </w:t>
             </w:r>
             <w:r>
               <w:br/>
@@ -33571,7 +33571,7 @@
               <w:rPr>
                 <w:rStyle w:val="CommentTok"/>
               </w:rPr>
-              <w:t xml:space="preserve">#&gt; (Intercept)                   2.8948     1.9293    1.50   0.1335   </w:t>
+              <w:t xml:space="preserve">#&gt; (Intercept)                   6.4536     1.8421    3.50  0.00046 ***</w:t>
             </w:r>
             <w:r>
               <w:br/>
@@ -33580,7 +33580,7 @@
               <w:rPr>
                 <w:rStyle w:val="CommentTok"/>
               </w:rPr>
-              <w:t xml:space="preserve">#&gt; homelesshomeless              2.5534     0.8024    3.18   0.0015 **</w:t>
+              <w:t xml:space="preserve">#&gt; homelesshomeless              1.1508     0.7366    1.56  0.11820    </w:t>
             </w:r>
             <w:r>
               <w:br/>
@@ -33589,7 +33589,7 @@
               <w:rPr>
                 <w:rStyle w:val="CommentTok"/>
               </w:rPr>
-              <w:t xml:space="preserve">#&gt; age                          -0.0729     0.0447   -1.63   0.1027   </w:t>
+              <w:t xml:space="preserve">#&gt; age                          -0.1485     0.0433   -3.43  0.00059 ***</w:t>
             </w:r>
             <w:r>
               <w:br/>
@@ -33598,7 +33598,7 @@
               <w:rPr>
                 <w:rStyle w:val="CommentTok"/>
               </w:rPr>
-              <w:t xml:space="preserve">#&gt; sexF                         -0.5545     0.8869   -0.63   0.5318   </w:t>
+              <w:t xml:space="preserve">#&gt; sexF                          0.2198     0.8179    0.27  0.78813    </w:t>
             </w:r>
             <w:r>
               <w:br/>
@@ -33607,7 +33607,7 @@
               <w:rPr>
                 <w:rStyle w:val="CommentTok"/>
               </w:rPr>
-              <w:t xml:space="preserve">#&gt; ethnAA                        0.9100     0.9416    0.97   0.3339   </w:t>
+              <w:t xml:space="preserve">#&gt; ethnAA                        1.5958     0.8890    1.79  0.07265 .  </w:t>
             </w:r>
             <w:r>
               <w:br/>
@@ -33616,7 +33616,7 @@
               <w:rPr>
                 <w:rStyle w:val="CommentTok"/>
               </w:rPr>
-              <w:t xml:space="preserve">#&gt; ethnHispanic                  2.6222     1.5835    1.66   0.0977 . </w:t>
+              <w:t xml:space="preserve">#&gt; ethnHispanic                  3.7763     1.5240    2.48  0.01322 *  </w:t>
             </w:r>
             <w:r>
               <w:br/>
@@ -33625,7 +33625,7 @@
               <w:rPr>
                 <w:rStyle w:val="CommentTok"/>
               </w:rPr>
-              <w:t xml:space="preserve">#&gt; ethnOther                    -1.5963     2.1745   -0.73   0.4629   </w:t>
+              <w:t xml:space="preserve">#&gt; ethnOther                    -3.2365     2.2663   -1.43  0.15327    </w:t>
             </w:r>
             <w:r>
               <w:br/>
@@ -33634,7 +33634,7 @@
               <w:rPr>
                 <w:rStyle w:val="CommentTok"/>
               </w:rPr>
-              <w:t xml:space="preserve">#&gt; polydrugmultiple drugs used  -3.7062     1.3330   -2.78   0.0054 **</w:t>
+              <w:t xml:space="preserve">#&gt; polydrugmultiple drugs used  -4.0532     1.0898   -3.72  0.00020 ***</w:t>
             </w:r>
             <w:r>
               <w:br/>
@@ -33643,7 +33643,7 @@
               <w:rPr>
                 <w:rStyle w:val="CommentTok"/>
               </w:rPr>
-              <w:t xml:space="preserve">#&gt; hivstatHIV+                  -3.4809     1.5036   -2.32   0.0206 * </w:t>
+              <w:t xml:space="preserve">#&gt; hivstatHIV+                  -1.1548     1.3185   -0.88  0.38113    </w:t>
             </w:r>
             <w:r>
               <w:br/>
@@ -33652,7 +33652,7 @@
               <w:rPr>
                 <w:rStyle w:val="CommentTok"/>
               </w:rPr>
-              <w:t xml:space="preserve">#&gt; sexabuseyes                  -1.5612     1.2484   -1.25   0.2111   </w:t>
+              <w:t xml:space="preserve">#&gt; sexabuseyes                  -2.6449     1.0772   -2.46  0.01408 *  </w:t>
             </w:r>
             <w:r>
               <w:br/>
@@ -33661,7 +33661,7 @@
               <w:rPr>
                 <w:rStyle w:val="CommentTok"/>
               </w:rPr>
-              <w:t xml:space="preserve">#&gt; hplsns                       -0.0449     0.0685   -0.66   0.5119   </w:t>
+              <w:t xml:space="preserve">#&gt; hplsns                        0.0948     0.0648    1.46  0.14306    </w:t>
             </w:r>
             <w:r>
               <w:br/>
@@ -33697,7 +33697,7 @@
               <w:rPr>
                 <w:rStyle w:val="CommentTok"/>
               </w:rPr>
-              <w:t xml:space="preserve">#&gt; (Dispersion parameter for Negative Binomial(0.0899) family taken to be 1)</w:t>
+              <w:t xml:space="preserve">#&gt; (Dispersion parameter for Negative Binomial(0.0913) family taken to be 1)</w:t>
             </w:r>
             <w:r>
               <w:br/>
@@ -33715,7 +33715,7 @@
               <w:rPr>
                 <w:rStyle w:val="CommentTok"/>
               </w:rPr>
-              <w:t xml:space="preserve">#&gt;     Null deviance: 61.511  on 108  degrees of freedom</w:t>
+              <w:t xml:space="preserve">#&gt;     Null deviance: 62.231  on 108  degrees of freedom</w:t>
             </w:r>
             <w:r>
               <w:br/>
@@ -33724,7 +33724,7 @@
               <w:rPr>
                 <w:rStyle w:val="CommentTok"/>
               </w:rPr>
-              <w:t xml:space="preserve">#&gt; Residual deviance: 52.284  on  98  degrees of freedom</w:t>
+              <w:t xml:space="preserve">#&gt; Residual deviance: 60.031  on  98  degrees of freedom</w:t>
             </w:r>
             <w:r>
               <w:br/>
@@ -33742,7 +33742,7 @@
               <w:rPr>
                 <w:rStyle w:val="CommentTok"/>
               </w:rPr>
-              <w:t xml:space="preserve">#&gt; AIC: 261.5</w:t>
+              <w:t xml:space="preserve">#&gt; AIC: 267.9</w:t>
             </w:r>
             <w:r>
               <w:br/>
@@ -33787,7 +33787,7 @@
               <w:rPr>
                 <w:rStyle w:val="CommentTok"/>
               </w:rPr>
-              <w:t xml:space="preserve">#&gt;               Theta:  0.0904 </w:t>
+              <w:t xml:space="preserve">#&gt;               Theta:  0.0832 </w:t>
             </w:r>
             <w:r>
               <w:br/>
@@ -33796,7 +33796,7 @@
               <w:rPr>
                 <w:rStyle w:val="CommentTok"/>
               </w:rPr>
-              <w:t xml:space="preserve">#&gt;           Std. Err.:  0.0239 </w:t>
+              <w:t xml:space="preserve">#&gt;           Std. Err.:  0.0216 </w:t>
             </w:r>
             <w:r>
               <w:br/>
@@ -33823,7 +33823,7 @@
               <w:rPr>
                 <w:rStyle w:val="CommentTok"/>
               </w:rPr>
-              <w:t xml:space="preserve">#&gt;  2 x log-likelihood:  -237.5430</w:t>
+              <w:t xml:space="preserve">#&gt;  2 x log-likelihood:  -243.8880</w:t>
             </w:r>
           </w:p>
           <w:bookmarkEnd w:id="87"/>
@@ -33999,7 +33999,7 @@
               <w:rPr>
                 <w:rStyle w:val="CommentTok"/>
               </w:rPr>
-              <w:t xml:space="preserve">#&gt;  1 (Intercept)                  1.31    2.89  </w:t>
+              <w:t xml:space="preserve">#&gt;  1 (Intercept)                  1.31    6.45  </w:t>
             </w:r>
             <w:r>
               <w:br/>
@@ -34008,7 +34008,7 @@
               <w:rPr>
                 <w:rStyle w:val="CommentTok"/>
               </w:rPr>
-              <w:t xml:space="preserve">#&gt;  2 homelesshomeless             1.80    2.55  </w:t>
+              <w:t xml:space="preserve">#&gt;  2 homelesshomeless             1.80    1.15  </w:t>
             </w:r>
             <w:r>
               <w:br/>
@@ -34017,7 +34017,7 @@
               <w:rPr>
                 <w:rStyle w:val="CommentTok"/>
               </w:rPr>
-              <w:t xml:space="preserve">#&gt;  3 age                         -0.0436 -0.0729</w:t>
+              <w:t xml:space="preserve">#&gt;  3 age                         -0.0436 -0.149 </w:t>
             </w:r>
             <w:r>
               <w:br/>
@@ -34026,7 +34026,7 @@
               <w:rPr>
                 <w:rStyle w:val="CommentTok"/>
               </w:rPr>
-              <w:t xml:space="preserve">#&gt;  4 sexF                         0.884  -0.555 </w:t>
+              <w:t xml:space="preserve">#&gt;  4 sexF                         0.884   0.220 </w:t>
             </w:r>
             <w:r>
               <w:br/>
@@ -34035,7 +34035,7 @@
               <w:rPr>
                 <w:rStyle w:val="CommentTok"/>
               </w:rPr>
-              <w:t xml:space="preserve">#&gt;  5 ethnAA                       0.953   0.910 </w:t>
+              <w:t xml:space="preserve">#&gt;  5 ethnAA                       0.953   1.60  </w:t>
             </w:r>
             <w:r>
               <w:br/>
@@ -34044,7 +34044,7 @@
               <w:rPr>
                 <w:rStyle w:val="CommentTok"/>
               </w:rPr>
-              <w:t xml:space="preserve">#&gt;  6 ethnHispanic                 0.578   2.62  </w:t>
+              <w:t xml:space="preserve">#&gt;  6 ethnHispanic                 0.578   3.78  </w:t>
             </w:r>
             <w:r>
               <w:br/>
@@ -34053,7 +34053,7 @@
               <w:rPr>
                 <w:rStyle w:val="CommentTok"/>
               </w:rPr>
-              <w:t xml:space="preserve">#&gt;  7 ethnOther                    0.0360 -1.60  </w:t>
+              <w:t xml:space="preserve">#&gt;  7 ethnOther                    0.0360 -3.24  </w:t>
             </w:r>
             <w:r>
               <w:br/>
@@ -34062,7 +34062,7 @@
               <w:rPr>
                 <w:rStyle w:val="CommentTok"/>
               </w:rPr>
-              <w:t xml:space="preserve">#&gt;  8 polydrugmultiple drugs used -1.68   -3.71  </w:t>
+              <w:t xml:space="preserve">#&gt;  8 polydrugmultiple drugs used -1.68   -4.05  </w:t>
             </w:r>
             <w:r>
               <w:br/>
@@ -34071,7 +34071,7 @@
               <w:rPr>
                 <w:rStyle w:val="CommentTok"/>
               </w:rPr>
-              <w:t xml:space="preserve">#&gt;  9 hivstatHIV+                 -2.18   -3.48  </w:t>
+              <w:t xml:space="preserve">#&gt;  9 hivstatHIV+                 -2.18   -1.15  </w:t>
             </w:r>
             <w:r>
               <w:br/>
@@ -34080,7 +34080,7 @@
               <w:rPr>
                 <w:rStyle w:val="CommentTok"/>
               </w:rPr>
-              <w:t xml:space="preserve">#&gt; 10 sexabuseyes                 -1.47   -1.56  </w:t>
+              <w:t xml:space="preserve">#&gt; 10 sexabuseyes                 -1.47   -2.64  </w:t>
             </w:r>
             <w:r>
               <w:br/>
@@ -34089,7 +34089,7 @@
               <w:rPr>
                 <w:rStyle w:val="CommentTok"/>
               </w:rPr>
-              <w:t xml:space="preserve">#&gt; 11 hplsns                      -0.0315 -0.0449</w:t>
+              <w:t xml:space="preserve">#&gt; 11 hplsns                      -0.0315  0.0948</w:t>
             </w:r>
           </w:p>
           <w:bookmarkEnd w:id="88"/>

</xml_diff>

<commit_message>
Deploying to gh-pages from @ d-morrison/rme@21664808397f484fb8e4521f5548cf3bcc36f3ec 🚀
</commit_message>
<xml_diff>
--- a/chapters/count-regression-handout.docx
+++ b/chapters/count-regression-handout.docx
@@ -33526,7 +33526,7 @@
               <w:rPr>
                 <w:rStyle w:val="CommentTok"/>
               </w:rPr>
-              <w:t xml:space="preserve">#&gt;     hivstat + sexabuse + hplsns, data = needles, init.theta = 0.08315440712, </w:t>
+              <w:t xml:space="preserve">#&gt;     hivstat + sexabuse + hplsns, data = needles, init.theta = 0.0903642555, </w:t>
             </w:r>
             <w:r>
               <w:br/>
@@ -33562,7 +33562,7 @@
               <w:rPr>
                 <w:rStyle w:val="CommentTok"/>
               </w:rPr>
-              <w:t xml:space="preserve">#&gt;                             Estimate Std. Error z value Pr(&gt;|z|)    </w:t>
+              <w:t xml:space="preserve">#&gt;                             Estimate Std. Error z value Pr(&gt;|z|)   </w:t>
             </w:r>
             <w:r>
               <w:br/>
@@ -33571,7 +33571,7 @@
               <w:rPr>
                 <w:rStyle w:val="CommentTok"/>
               </w:rPr>
-              <w:t xml:space="preserve">#&gt; (Intercept)                   6.4536     1.8421    3.50  0.00046 ***</w:t>
+              <w:t xml:space="preserve">#&gt; (Intercept)                   2.8948     1.9293    1.50   0.1335   </w:t>
             </w:r>
             <w:r>
               <w:br/>
@@ -33580,7 +33580,7 @@
               <w:rPr>
                 <w:rStyle w:val="CommentTok"/>
               </w:rPr>
-              <w:t xml:space="preserve">#&gt; homelesshomeless              1.1508     0.7366    1.56  0.11820    </w:t>
+              <w:t xml:space="preserve">#&gt; homelesshomeless              2.5534     0.8024    3.18   0.0015 **</w:t>
             </w:r>
             <w:r>
               <w:br/>
@@ -33589,7 +33589,7 @@
               <w:rPr>
                 <w:rStyle w:val="CommentTok"/>
               </w:rPr>
-              <w:t xml:space="preserve">#&gt; age                          -0.1485     0.0433   -3.43  0.00059 ***</w:t>
+              <w:t xml:space="preserve">#&gt; age                          -0.0729     0.0447   -1.63   0.1027   </w:t>
             </w:r>
             <w:r>
               <w:br/>
@@ -33598,7 +33598,7 @@
               <w:rPr>
                 <w:rStyle w:val="CommentTok"/>
               </w:rPr>
-              <w:t xml:space="preserve">#&gt; sexF                          0.2198     0.8179    0.27  0.78813    </w:t>
+              <w:t xml:space="preserve">#&gt; sexF                         -0.5545     0.8869   -0.63   0.5318   </w:t>
             </w:r>
             <w:r>
               <w:br/>
@@ -33607,7 +33607,7 @@
               <w:rPr>
                 <w:rStyle w:val="CommentTok"/>
               </w:rPr>
-              <w:t xml:space="preserve">#&gt; ethnAA                        1.5958     0.8890    1.79  0.07265 .  </w:t>
+              <w:t xml:space="preserve">#&gt; ethnAA                        0.9100     0.9416    0.97   0.3339   </w:t>
             </w:r>
             <w:r>
               <w:br/>
@@ -33616,7 +33616,7 @@
               <w:rPr>
                 <w:rStyle w:val="CommentTok"/>
               </w:rPr>
-              <w:t xml:space="preserve">#&gt; ethnHispanic                  3.7763     1.5240    2.48  0.01322 *  </w:t>
+              <w:t xml:space="preserve">#&gt; ethnHispanic                  2.6222     1.5835    1.66   0.0977 . </w:t>
             </w:r>
             <w:r>
               <w:br/>
@@ -33625,7 +33625,7 @@
               <w:rPr>
                 <w:rStyle w:val="CommentTok"/>
               </w:rPr>
-              <w:t xml:space="preserve">#&gt; ethnOther                    -3.2365     2.2663   -1.43  0.15327    </w:t>
+              <w:t xml:space="preserve">#&gt; ethnOther                    -1.5963     2.1745   -0.73   0.4629   </w:t>
             </w:r>
             <w:r>
               <w:br/>
@@ -33634,7 +33634,7 @@
               <w:rPr>
                 <w:rStyle w:val="CommentTok"/>
               </w:rPr>
-              <w:t xml:space="preserve">#&gt; polydrugmultiple drugs used  -4.0532     1.0898   -3.72  0.00020 ***</w:t>
+              <w:t xml:space="preserve">#&gt; polydrugmultiple drugs used  -3.7062     1.3330   -2.78   0.0054 **</w:t>
             </w:r>
             <w:r>
               <w:br/>
@@ -33643,7 +33643,7 @@
               <w:rPr>
                 <w:rStyle w:val="CommentTok"/>
               </w:rPr>
-              <w:t xml:space="preserve">#&gt; hivstatHIV+                  -1.1548     1.3185   -0.88  0.38113    </w:t>
+              <w:t xml:space="preserve">#&gt; hivstatHIV+                  -3.4809     1.5036   -2.32   0.0206 * </w:t>
             </w:r>
             <w:r>
               <w:br/>
@@ -33652,7 +33652,7 @@
               <w:rPr>
                 <w:rStyle w:val="CommentTok"/>
               </w:rPr>
-              <w:t xml:space="preserve">#&gt; sexabuseyes                  -2.6449     1.0772   -2.46  0.01408 *  </w:t>
+              <w:t xml:space="preserve">#&gt; sexabuseyes                  -1.5612     1.2484   -1.25   0.2111   </w:t>
             </w:r>
             <w:r>
               <w:br/>
@@ -33661,7 +33661,7 @@
               <w:rPr>
                 <w:rStyle w:val="CommentTok"/>
               </w:rPr>
-              <w:t xml:space="preserve">#&gt; hplsns                        0.0948     0.0648    1.46  0.14306    </w:t>
+              <w:t xml:space="preserve">#&gt; hplsns                       -0.0449     0.0685   -0.66   0.5119   </w:t>
             </w:r>
             <w:r>
               <w:br/>
@@ -33697,7 +33697,7 @@
               <w:rPr>
                 <w:rStyle w:val="CommentTok"/>
               </w:rPr>
-              <w:t xml:space="preserve">#&gt; (Dispersion parameter for Negative Binomial(0.0913) family taken to be 1)</w:t>
+              <w:t xml:space="preserve">#&gt; (Dispersion parameter for Negative Binomial(0.0899) family taken to be 1)</w:t>
             </w:r>
             <w:r>
               <w:br/>
@@ -33715,7 +33715,7 @@
               <w:rPr>
                 <w:rStyle w:val="CommentTok"/>
               </w:rPr>
-              <w:t xml:space="preserve">#&gt;     Null deviance: 62.231  on 108  degrees of freedom</w:t>
+              <w:t xml:space="preserve">#&gt;     Null deviance: 61.511  on 108  degrees of freedom</w:t>
             </w:r>
             <w:r>
               <w:br/>
@@ -33724,7 +33724,7 @@
               <w:rPr>
                 <w:rStyle w:val="CommentTok"/>
               </w:rPr>
-              <w:t xml:space="preserve">#&gt; Residual deviance: 60.031  on  98  degrees of freedom</w:t>
+              <w:t xml:space="preserve">#&gt; Residual deviance: 52.284  on  98  degrees of freedom</w:t>
             </w:r>
             <w:r>
               <w:br/>
@@ -33742,7 +33742,7 @@
               <w:rPr>
                 <w:rStyle w:val="CommentTok"/>
               </w:rPr>
-              <w:t xml:space="preserve">#&gt; AIC: 267.9</w:t>
+              <w:t xml:space="preserve">#&gt; AIC: 261.5</w:t>
             </w:r>
             <w:r>
               <w:br/>
@@ -33787,7 +33787,7 @@
               <w:rPr>
                 <w:rStyle w:val="CommentTok"/>
               </w:rPr>
-              <w:t xml:space="preserve">#&gt;               Theta:  0.0832 </w:t>
+              <w:t xml:space="preserve">#&gt;               Theta:  0.0904 </w:t>
             </w:r>
             <w:r>
               <w:br/>
@@ -33796,7 +33796,7 @@
               <w:rPr>
                 <w:rStyle w:val="CommentTok"/>
               </w:rPr>
-              <w:t xml:space="preserve">#&gt;           Std. Err.:  0.0216 </w:t>
+              <w:t xml:space="preserve">#&gt;           Std. Err.:  0.0239 </w:t>
             </w:r>
             <w:r>
               <w:br/>
@@ -33823,7 +33823,7 @@
               <w:rPr>
                 <w:rStyle w:val="CommentTok"/>
               </w:rPr>
-              <w:t xml:space="preserve">#&gt;  2 x log-likelihood:  -243.8880</w:t>
+              <w:t xml:space="preserve">#&gt;  2 x log-likelihood:  -237.5430</w:t>
             </w:r>
           </w:p>
           <w:bookmarkEnd w:id="87"/>
@@ -33999,7 +33999,7 @@
               <w:rPr>
                 <w:rStyle w:val="CommentTok"/>
               </w:rPr>
-              <w:t xml:space="preserve">#&gt;  1 (Intercept)                  1.31    6.45  </w:t>
+              <w:t xml:space="preserve">#&gt;  1 (Intercept)                  1.31    2.89  </w:t>
             </w:r>
             <w:r>
               <w:br/>
@@ -34008,7 +34008,7 @@
               <w:rPr>
                 <w:rStyle w:val="CommentTok"/>
               </w:rPr>
-              <w:t xml:space="preserve">#&gt;  2 homelesshomeless             1.80    1.15  </w:t>
+              <w:t xml:space="preserve">#&gt;  2 homelesshomeless             1.80    2.55  </w:t>
             </w:r>
             <w:r>
               <w:br/>
@@ -34017,7 +34017,7 @@
               <w:rPr>
                 <w:rStyle w:val="CommentTok"/>
               </w:rPr>
-              <w:t xml:space="preserve">#&gt;  3 age                         -0.0436 -0.149 </w:t>
+              <w:t xml:space="preserve">#&gt;  3 age                         -0.0436 -0.0729</w:t>
             </w:r>
             <w:r>
               <w:br/>
@@ -34026,7 +34026,7 @@
               <w:rPr>
                 <w:rStyle w:val="CommentTok"/>
               </w:rPr>
-              <w:t xml:space="preserve">#&gt;  4 sexF                         0.884   0.220 </w:t>
+              <w:t xml:space="preserve">#&gt;  4 sexF                         0.884  -0.555 </w:t>
             </w:r>
             <w:r>
               <w:br/>
@@ -34035,7 +34035,7 @@
               <w:rPr>
                 <w:rStyle w:val="CommentTok"/>
               </w:rPr>
-              <w:t xml:space="preserve">#&gt;  5 ethnAA                       0.953   1.60  </w:t>
+              <w:t xml:space="preserve">#&gt;  5 ethnAA                       0.953   0.910 </w:t>
             </w:r>
             <w:r>
               <w:br/>
@@ -34044,7 +34044,7 @@
               <w:rPr>
                 <w:rStyle w:val="CommentTok"/>
               </w:rPr>
-              <w:t xml:space="preserve">#&gt;  6 ethnHispanic                 0.578   3.78  </w:t>
+              <w:t xml:space="preserve">#&gt;  6 ethnHispanic                 0.578   2.62  </w:t>
             </w:r>
             <w:r>
               <w:br/>
@@ -34053,7 +34053,7 @@
               <w:rPr>
                 <w:rStyle w:val="CommentTok"/>
               </w:rPr>
-              <w:t xml:space="preserve">#&gt;  7 ethnOther                    0.0360 -3.24  </w:t>
+              <w:t xml:space="preserve">#&gt;  7 ethnOther                    0.0360 -1.60  </w:t>
             </w:r>
             <w:r>
               <w:br/>
@@ -34062,7 +34062,7 @@
               <w:rPr>
                 <w:rStyle w:val="CommentTok"/>
               </w:rPr>
-              <w:t xml:space="preserve">#&gt;  8 polydrugmultiple drugs used -1.68   -4.05  </w:t>
+              <w:t xml:space="preserve">#&gt;  8 polydrugmultiple drugs used -1.68   -3.71  </w:t>
             </w:r>
             <w:r>
               <w:br/>
@@ -34071,7 +34071,7 @@
               <w:rPr>
                 <w:rStyle w:val="CommentTok"/>
               </w:rPr>
-              <w:t xml:space="preserve">#&gt;  9 hivstatHIV+                 -2.18   -1.15  </w:t>
+              <w:t xml:space="preserve">#&gt;  9 hivstatHIV+                 -2.18   -3.48  </w:t>
             </w:r>
             <w:r>
               <w:br/>
@@ -34080,7 +34080,7 @@
               <w:rPr>
                 <w:rStyle w:val="CommentTok"/>
               </w:rPr>
-              <w:t xml:space="preserve">#&gt; 10 sexabuseyes                 -1.47   -2.64  </w:t>
+              <w:t xml:space="preserve">#&gt; 10 sexabuseyes                 -1.47   -1.56  </w:t>
             </w:r>
             <w:r>
               <w:br/>
@@ -34089,7 +34089,7 @@
               <w:rPr>
                 <w:rStyle w:val="CommentTok"/>
               </w:rPr>
-              <w:t xml:space="preserve">#&gt; 11 hplsns                      -0.0315  0.0948</w:t>
+              <w:t xml:space="preserve">#&gt; 11 hplsns                      -0.0315 -0.0449</w:t>
             </w:r>
           </w:p>
           <w:bookmarkEnd w:id="88"/>

</xml_diff>

<commit_message>
Deploying to gh-pages from @ d-morrison/rme@039764e569216ca807a0a1c340066bf93582b35b 🚀
</commit_message>
<xml_diff>
--- a/chapters/count-regression-handout.docx
+++ b/chapters/count-regression-handout.docx
@@ -33540,7 +33540,7 @@
               <w:rPr>
                 <w:rStyle w:val="CommentTok"/>
               </w:rPr>
-              <w:t xml:space="preserve">#&gt;     hivstat + sexabuse + hplsns, data = needles, init.theta = 0.0903642555, </w:t>
+              <w:t xml:space="preserve">#&gt;     hivstat + sexabuse + hplsns, data = needles, init.theta = 0.08315440712, </w:t>
             </w:r>
             <w:r>
               <w:br/>
@@ -33576,7 +33576,7 @@
               <w:rPr>
                 <w:rStyle w:val="CommentTok"/>
               </w:rPr>
-              <w:t xml:space="preserve">#&gt;                             Estimate Std. Error z value Pr(&gt;|z|)   </w:t>
+              <w:t xml:space="preserve">#&gt;                             Estimate Std. Error z value Pr(&gt;|z|)    </w:t>
             </w:r>
             <w:r>
               <w:br/>
@@ -33585,7 +33585,7 @@
               <w:rPr>
                 <w:rStyle w:val="CommentTok"/>
               </w:rPr>
-              <w:t xml:space="preserve">#&gt; (Intercept)                   2.8948     1.9293    1.50   0.1335   </w:t>
+              <w:t xml:space="preserve">#&gt; (Intercept)                   6.4536     1.8421    3.50  0.00046 ***</w:t>
             </w:r>
             <w:r>
               <w:br/>
@@ -33594,7 +33594,7 @@
               <w:rPr>
                 <w:rStyle w:val="CommentTok"/>
               </w:rPr>
-              <w:t xml:space="preserve">#&gt; homelesshomeless              2.5534     0.8024    3.18   0.0015 **</w:t>
+              <w:t xml:space="preserve">#&gt; homelesshomeless              1.1508     0.7366    1.56  0.11820    </w:t>
             </w:r>
             <w:r>
               <w:br/>
@@ -33603,7 +33603,7 @@
               <w:rPr>
                 <w:rStyle w:val="CommentTok"/>
               </w:rPr>
-              <w:t xml:space="preserve">#&gt; age                          -0.0729     0.0447   -1.63   0.1027   </w:t>
+              <w:t xml:space="preserve">#&gt; age                          -0.1485     0.0433   -3.43  0.00059 ***</w:t>
             </w:r>
             <w:r>
               <w:br/>
@@ -33612,7 +33612,7 @@
               <w:rPr>
                 <w:rStyle w:val="CommentTok"/>
               </w:rPr>
-              <w:t xml:space="preserve">#&gt; sexF                         -0.5545     0.8869   -0.63   0.5318   </w:t>
+              <w:t xml:space="preserve">#&gt; sexF                          0.2198     0.8179    0.27  0.78813    </w:t>
             </w:r>
             <w:r>
               <w:br/>
@@ -33621,7 +33621,7 @@
               <w:rPr>
                 <w:rStyle w:val="CommentTok"/>
               </w:rPr>
-              <w:t xml:space="preserve">#&gt; ethnAA                        0.9100     0.9416    0.97   0.3339   </w:t>
+              <w:t xml:space="preserve">#&gt; ethnAA                        1.5958     0.8890    1.79  0.07265 .  </w:t>
             </w:r>
             <w:r>
               <w:br/>
@@ -33630,7 +33630,7 @@
               <w:rPr>
                 <w:rStyle w:val="CommentTok"/>
               </w:rPr>
-              <w:t xml:space="preserve">#&gt; ethnHispanic                  2.6222     1.5835    1.66   0.0977 . </w:t>
+              <w:t xml:space="preserve">#&gt; ethnHispanic                  3.7763     1.5240    2.48  0.01322 *  </w:t>
             </w:r>
             <w:r>
               <w:br/>
@@ -33639,7 +33639,7 @@
               <w:rPr>
                 <w:rStyle w:val="CommentTok"/>
               </w:rPr>
-              <w:t xml:space="preserve">#&gt; ethnOther                    -1.5963     2.1745   -0.73   0.4629   </w:t>
+              <w:t xml:space="preserve">#&gt; ethnOther                    -3.2365     2.2663   -1.43  0.15327    </w:t>
             </w:r>
             <w:r>
               <w:br/>
@@ -33648,7 +33648,7 @@
               <w:rPr>
                 <w:rStyle w:val="CommentTok"/>
               </w:rPr>
-              <w:t xml:space="preserve">#&gt; polydrugmultiple drugs used  -3.7062     1.3330   -2.78   0.0054 **</w:t>
+              <w:t xml:space="preserve">#&gt; polydrugmultiple drugs used  -4.0532     1.0898   -3.72  0.00020 ***</w:t>
             </w:r>
             <w:r>
               <w:br/>
@@ -33657,7 +33657,7 @@
               <w:rPr>
                 <w:rStyle w:val="CommentTok"/>
               </w:rPr>
-              <w:t xml:space="preserve">#&gt; hivstatHIV+                  -3.4809     1.5036   -2.32   0.0206 * </w:t>
+              <w:t xml:space="preserve">#&gt; hivstatHIV+                  -1.1548     1.3185   -0.88  0.38113    </w:t>
             </w:r>
             <w:r>
               <w:br/>
@@ -33666,7 +33666,7 @@
               <w:rPr>
                 <w:rStyle w:val="CommentTok"/>
               </w:rPr>
-              <w:t xml:space="preserve">#&gt; sexabuseyes                  -1.5612     1.2484   -1.25   0.2111   </w:t>
+              <w:t xml:space="preserve">#&gt; sexabuseyes                  -2.6449     1.0772   -2.46  0.01408 *  </w:t>
             </w:r>
             <w:r>
               <w:br/>
@@ -33675,7 +33675,7 @@
               <w:rPr>
                 <w:rStyle w:val="CommentTok"/>
               </w:rPr>
-              <w:t xml:space="preserve">#&gt; hplsns                       -0.0449     0.0685   -0.66   0.5119   </w:t>
+              <w:t xml:space="preserve">#&gt; hplsns                        0.0948     0.0648    1.46  0.14306    </w:t>
             </w:r>
             <w:r>
               <w:br/>
@@ -33711,7 +33711,7 @@
               <w:rPr>
                 <w:rStyle w:val="CommentTok"/>
               </w:rPr>
-              <w:t xml:space="preserve">#&gt; (Dispersion parameter for Negative Binomial(0.0899) family taken to be 1)</w:t>
+              <w:t xml:space="preserve">#&gt; (Dispersion parameter for Negative Binomial(0.0913) family taken to be 1)</w:t>
             </w:r>
             <w:r>
               <w:br/>
@@ -33729,7 +33729,7 @@
               <w:rPr>
                 <w:rStyle w:val="CommentTok"/>
               </w:rPr>
-              <w:t xml:space="preserve">#&gt;     Null deviance: 61.511  on 108  degrees of freedom</w:t>
+              <w:t xml:space="preserve">#&gt;     Null deviance: 62.231  on 108  degrees of freedom</w:t>
             </w:r>
             <w:r>
               <w:br/>
@@ -33738,7 +33738,7 @@
               <w:rPr>
                 <w:rStyle w:val="CommentTok"/>
               </w:rPr>
-              <w:t xml:space="preserve">#&gt; Residual deviance: 52.284  on  98  degrees of freedom</w:t>
+              <w:t xml:space="preserve">#&gt; Residual deviance: 60.031  on  98  degrees of freedom</w:t>
             </w:r>
             <w:r>
               <w:br/>
@@ -33756,7 +33756,7 @@
               <w:rPr>
                 <w:rStyle w:val="CommentTok"/>
               </w:rPr>
-              <w:t xml:space="preserve">#&gt; AIC: 261.5</w:t>
+              <w:t xml:space="preserve">#&gt; AIC: 267.9</w:t>
             </w:r>
             <w:r>
               <w:br/>
@@ -33801,7 +33801,7 @@
               <w:rPr>
                 <w:rStyle w:val="CommentTok"/>
               </w:rPr>
-              <w:t xml:space="preserve">#&gt;               Theta:  0.0904 </w:t>
+              <w:t xml:space="preserve">#&gt;               Theta:  0.0832 </w:t>
             </w:r>
             <w:r>
               <w:br/>
@@ -33810,7 +33810,7 @@
               <w:rPr>
                 <w:rStyle w:val="CommentTok"/>
               </w:rPr>
-              <w:t xml:space="preserve">#&gt;           Std. Err.:  0.0239 </w:t>
+              <w:t xml:space="preserve">#&gt;           Std. Err.:  0.0216 </w:t>
             </w:r>
             <w:r>
               <w:br/>
@@ -33837,7 +33837,7 @@
               <w:rPr>
                 <w:rStyle w:val="CommentTok"/>
               </w:rPr>
-              <w:t xml:space="preserve">#&gt;  2 x log-likelihood:  -237.5430</w:t>
+              <w:t xml:space="preserve">#&gt;  2 x log-likelihood:  -243.8880</w:t>
             </w:r>
           </w:p>
           <w:bookmarkEnd w:id="87"/>
@@ -34013,7 +34013,7 @@
               <w:rPr>
                 <w:rStyle w:val="CommentTok"/>
               </w:rPr>
-              <w:t xml:space="preserve">#&gt;  1 (Intercept)                  1.31    2.89  </w:t>
+              <w:t xml:space="preserve">#&gt;  1 (Intercept)                  1.31    6.45  </w:t>
             </w:r>
             <w:r>
               <w:br/>
@@ -34022,7 +34022,7 @@
               <w:rPr>
                 <w:rStyle w:val="CommentTok"/>
               </w:rPr>
-              <w:t xml:space="preserve">#&gt;  2 homelesshomeless             1.80    2.55  </w:t>
+              <w:t xml:space="preserve">#&gt;  2 homelesshomeless             1.80    1.15  </w:t>
             </w:r>
             <w:r>
               <w:br/>
@@ -34031,7 +34031,7 @@
               <w:rPr>
                 <w:rStyle w:val="CommentTok"/>
               </w:rPr>
-              <w:t xml:space="preserve">#&gt;  3 age                         -0.0436 -0.0729</w:t>
+              <w:t xml:space="preserve">#&gt;  3 age                         -0.0436 -0.149 </w:t>
             </w:r>
             <w:r>
               <w:br/>
@@ -34040,7 +34040,7 @@
               <w:rPr>
                 <w:rStyle w:val="CommentTok"/>
               </w:rPr>
-              <w:t xml:space="preserve">#&gt;  4 sexF                         0.884  -0.555 </w:t>
+              <w:t xml:space="preserve">#&gt;  4 sexF                         0.884   0.220 </w:t>
             </w:r>
             <w:r>
               <w:br/>
@@ -34049,7 +34049,7 @@
               <w:rPr>
                 <w:rStyle w:val="CommentTok"/>
               </w:rPr>
-              <w:t xml:space="preserve">#&gt;  5 ethnAA                       0.953   0.910 </w:t>
+              <w:t xml:space="preserve">#&gt;  5 ethnAA                       0.953   1.60  </w:t>
             </w:r>
             <w:r>
               <w:br/>
@@ -34058,7 +34058,7 @@
               <w:rPr>
                 <w:rStyle w:val="CommentTok"/>
               </w:rPr>
-              <w:t xml:space="preserve">#&gt;  6 ethnHispanic                 0.578   2.62  </w:t>
+              <w:t xml:space="preserve">#&gt;  6 ethnHispanic                 0.578   3.78  </w:t>
             </w:r>
             <w:r>
               <w:br/>
@@ -34067,7 +34067,7 @@
               <w:rPr>
                 <w:rStyle w:val="CommentTok"/>
               </w:rPr>
-              <w:t xml:space="preserve">#&gt;  7 ethnOther                    0.0360 -1.60  </w:t>
+              <w:t xml:space="preserve">#&gt;  7 ethnOther                    0.0360 -3.24  </w:t>
             </w:r>
             <w:r>
               <w:br/>
@@ -34076,7 +34076,7 @@
               <w:rPr>
                 <w:rStyle w:val="CommentTok"/>
               </w:rPr>
-              <w:t xml:space="preserve">#&gt;  8 polydrugmultiple drugs used -1.68   -3.71  </w:t>
+              <w:t xml:space="preserve">#&gt;  8 polydrugmultiple drugs used -1.68   -4.05  </w:t>
             </w:r>
             <w:r>
               <w:br/>
@@ -34085,7 +34085,7 @@
               <w:rPr>
                 <w:rStyle w:val="CommentTok"/>
               </w:rPr>
-              <w:t xml:space="preserve">#&gt;  9 hivstatHIV+                 -2.18   -3.48  </w:t>
+              <w:t xml:space="preserve">#&gt;  9 hivstatHIV+                 -2.18   -1.15  </w:t>
             </w:r>
             <w:r>
               <w:br/>
@@ -34094,7 +34094,7 @@
               <w:rPr>
                 <w:rStyle w:val="CommentTok"/>
               </w:rPr>
-              <w:t xml:space="preserve">#&gt; 10 sexabuseyes                 -1.47   -1.56  </w:t>
+              <w:t xml:space="preserve">#&gt; 10 sexabuseyes                 -1.47   -2.64  </w:t>
             </w:r>
             <w:r>
               <w:br/>
@@ -34103,7 +34103,7 @@
               <w:rPr>
                 <w:rStyle w:val="CommentTok"/>
               </w:rPr>
-              <w:t xml:space="preserve">#&gt; 11 hplsns                      -0.0315 -0.0449</w:t>
+              <w:t xml:space="preserve">#&gt; 11 hplsns                      -0.0315  0.0948</w:t>
             </w:r>
           </w:p>
           <w:bookmarkEnd w:id="88"/>

</xml_diff>

<commit_message>
Deploying to gh-pages from @ d-morrison/rme@5db151338b8a148b5cfbbc1e74c2f7df75fc518a 🚀
</commit_message>
<xml_diff>
--- a/chapters/count-regression-handout.docx
+++ b/chapters/count-regression-handout.docx
@@ -33540,7 +33540,7 @@
               <w:rPr>
                 <w:rStyle w:val="CommentTok"/>
               </w:rPr>
-              <w:t xml:space="preserve">#&gt;     hivstat + sexabuse + hplsns, data = needles, init.theta = 0.08315440712, </w:t>
+              <w:t xml:space="preserve">#&gt;     hivstat + sexabuse + hplsns, data = needles, init.theta = 0.0903642555, </w:t>
             </w:r>
             <w:r>
               <w:br/>
@@ -33576,7 +33576,7 @@
               <w:rPr>
                 <w:rStyle w:val="CommentTok"/>
               </w:rPr>
-              <w:t xml:space="preserve">#&gt;                             Estimate Std. Error z value Pr(&gt;|z|)    </w:t>
+              <w:t xml:space="preserve">#&gt;                             Estimate Std. Error z value Pr(&gt;|z|)   </w:t>
             </w:r>
             <w:r>
               <w:br/>
@@ -33585,7 +33585,7 @@
               <w:rPr>
                 <w:rStyle w:val="CommentTok"/>
               </w:rPr>
-              <w:t xml:space="preserve">#&gt; (Intercept)                   6.4536     1.8421    3.50  0.00046 ***</w:t>
+              <w:t xml:space="preserve">#&gt; (Intercept)                   2.8948     1.9293    1.50   0.1335   </w:t>
             </w:r>
             <w:r>
               <w:br/>
@@ -33594,7 +33594,7 @@
               <w:rPr>
                 <w:rStyle w:val="CommentTok"/>
               </w:rPr>
-              <w:t xml:space="preserve">#&gt; homelesshomeless              1.1508     0.7366    1.56  0.11820    </w:t>
+              <w:t xml:space="preserve">#&gt; homelesshomeless              2.5534     0.8024    3.18   0.0015 **</w:t>
             </w:r>
             <w:r>
               <w:br/>
@@ -33603,7 +33603,7 @@
               <w:rPr>
                 <w:rStyle w:val="CommentTok"/>
               </w:rPr>
-              <w:t xml:space="preserve">#&gt; age                          -0.1485     0.0433   -3.43  0.00059 ***</w:t>
+              <w:t xml:space="preserve">#&gt; age                          -0.0729     0.0447   -1.63   0.1027   </w:t>
             </w:r>
             <w:r>
               <w:br/>
@@ -33612,7 +33612,7 @@
               <w:rPr>
                 <w:rStyle w:val="CommentTok"/>
               </w:rPr>
-              <w:t xml:space="preserve">#&gt; sexF                          0.2198     0.8179    0.27  0.78813    </w:t>
+              <w:t xml:space="preserve">#&gt; sexF                         -0.5545     0.8869   -0.63   0.5318   </w:t>
             </w:r>
             <w:r>
               <w:br/>
@@ -33621,7 +33621,7 @@
               <w:rPr>
                 <w:rStyle w:val="CommentTok"/>
               </w:rPr>
-              <w:t xml:space="preserve">#&gt; ethnAA                        1.5958     0.8890    1.79  0.07265 .  </w:t>
+              <w:t xml:space="preserve">#&gt; ethnAA                        0.9100     0.9416    0.97   0.3339   </w:t>
             </w:r>
             <w:r>
               <w:br/>
@@ -33630,7 +33630,7 @@
               <w:rPr>
                 <w:rStyle w:val="CommentTok"/>
               </w:rPr>
-              <w:t xml:space="preserve">#&gt; ethnHispanic                  3.7763     1.5240    2.48  0.01322 *  </w:t>
+              <w:t xml:space="preserve">#&gt; ethnHispanic                  2.6222     1.5835    1.66   0.0977 . </w:t>
             </w:r>
             <w:r>
               <w:br/>
@@ -33639,7 +33639,7 @@
               <w:rPr>
                 <w:rStyle w:val="CommentTok"/>
               </w:rPr>
-              <w:t xml:space="preserve">#&gt; ethnOther                    -3.2365     2.2663   -1.43  0.15327    </w:t>
+              <w:t xml:space="preserve">#&gt; ethnOther                    -1.5963     2.1745   -0.73   0.4629   </w:t>
             </w:r>
             <w:r>
               <w:br/>
@@ -33648,7 +33648,7 @@
               <w:rPr>
                 <w:rStyle w:val="CommentTok"/>
               </w:rPr>
-              <w:t xml:space="preserve">#&gt; polydrugmultiple drugs used  -4.0532     1.0898   -3.72  0.00020 ***</w:t>
+              <w:t xml:space="preserve">#&gt; polydrugmultiple drugs used  -3.7062     1.3330   -2.78   0.0054 **</w:t>
             </w:r>
             <w:r>
               <w:br/>
@@ -33657,7 +33657,7 @@
               <w:rPr>
                 <w:rStyle w:val="CommentTok"/>
               </w:rPr>
-              <w:t xml:space="preserve">#&gt; hivstatHIV+                  -1.1548     1.3185   -0.88  0.38113    </w:t>
+              <w:t xml:space="preserve">#&gt; hivstatHIV+                  -3.4809     1.5036   -2.32   0.0206 * </w:t>
             </w:r>
             <w:r>
               <w:br/>
@@ -33666,7 +33666,7 @@
               <w:rPr>
                 <w:rStyle w:val="CommentTok"/>
               </w:rPr>
-              <w:t xml:space="preserve">#&gt; sexabuseyes                  -2.6449     1.0772   -2.46  0.01408 *  </w:t>
+              <w:t xml:space="preserve">#&gt; sexabuseyes                  -1.5612     1.2484   -1.25   0.2111   </w:t>
             </w:r>
             <w:r>
               <w:br/>
@@ -33675,7 +33675,7 @@
               <w:rPr>
                 <w:rStyle w:val="CommentTok"/>
               </w:rPr>
-              <w:t xml:space="preserve">#&gt; hplsns                        0.0948     0.0648    1.46  0.14306    </w:t>
+              <w:t xml:space="preserve">#&gt; hplsns                       -0.0449     0.0685   -0.66   0.5119   </w:t>
             </w:r>
             <w:r>
               <w:br/>
@@ -33711,7 +33711,7 @@
               <w:rPr>
                 <w:rStyle w:val="CommentTok"/>
               </w:rPr>
-              <w:t xml:space="preserve">#&gt; (Dispersion parameter for Negative Binomial(0.0913) family taken to be 1)</w:t>
+              <w:t xml:space="preserve">#&gt; (Dispersion parameter for Negative Binomial(0.0899) family taken to be 1)</w:t>
             </w:r>
             <w:r>
               <w:br/>
@@ -33729,7 +33729,7 @@
               <w:rPr>
                 <w:rStyle w:val="CommentTok"/>
               </w:rPr>
-              <w:t xml:space="preserve">#&gt;     Null deviance: 62.231  on 108  degrees of freedom</w:t>
+              <w:t xml:space="preserve">#&gt;     Null deviance: 61.511  on 108  degrees of freedom</w:t>
             </w:r>
             <w:r>
               <w:br/>
@@ -33738,7 +33738,7 @@
               <w:rPr>
                 <w:rStyle w:val="CommentTok"/>
               </w:rPr>
-              <w:t xml:space="preserve">#&gt; Residual deviance: 60.031  on  98  degrees of freedom</w:t>
+              <w:t xml:space="preserve">#&gt; Residual deviance: 52.284  on  98  degrees of freedom</w:t>
             </w:r>
             <w:r>
               <w:br/>
@@ -33756,7 +33756,7 @@
               <w:rPr>
                 <w:rStyle w:val="CommentTok"/>
               </w:rPr>
-              <w:t xml:space="preserve">#&gt; AIC: 267.9</w:t>
+              <w:t xml:space="preserve">#&gt; AIC: 261.5</w:t>
             </w:r>
             <w:r>
               <w:br/>
@@ -33801,7 +33801,7 @@
               <w:rPr>
                 <w:rStyle w:val="CommentTok"/>
               </w:rPr>
-              <w:t xml:space="preserve">#&gt;               Theta:  0.0832 </w:t>
+              <w:t xml:space="preserve">#&gt;               Theta:  0.0904 </w:t>
             </w:r>
             <w:r>
               <w:br/>
@@ -33810,7 +33810,7 @@
               <w:rPr>
                 <w:rStyle w:val="CommentTok"/>
               </w:rPr>
-              <w:t xml:space="preserve">#&gt;           Std. Err.:  0.0216 </w:t>
+              <w:t xml:space="preserve">#&gt;           Std. Err.:  0.0239 </w:t>
             </w:r>
             <w:r>
               <w:br/>
@@ -33837,7 +33837,7 @@
               <w:rPr>
                 <w:rStyle w:val="CommentTok"/>
               </w:rPr>
-              <w:t xml:space="preserve">#&gt;  2 x log-likelihood:  -243.8880</w:t>
+              <w:t xml:space="preserve">#&gt;  2 x log-likelihood:  -237.5430</w:t>
             </w:r>
           </w:p>
           <w:bookmarkEnd w:id="87"/>
@@ -34013,7 +34013,7 @@
               <w:rPr>
                 <w:rStyle w:val="CommentTok"/>
               </w:rPr>
-              <w:t xml:space="preserve">#&gt;  1 (Intercept)                  1.31    6.45  </w:t>
+              <w:t xml:space="preserve">#&gt;  1 (Intercept)                  1.31    2.89  </w:t>
             </w:r>
             <w:r>
               <w:br/>
@@ -34022,7 +34022,7 @@
               <w:rPr>
                 <w:rStyle w:val="CommentTok"/>
               </w:rPr>
-              <w:t xml:space="preserve">#&gt;  2 homelesshomeless             1.80    1.15  </w:t>
+              <w:t xml:space="preserve">#&gt;  2 homelesshomeless             1.80    2.55  </w:t>
             </w:r>
             <w:r>
               <w:br/>
@@ -34031,7 +34031,7 @@
               <w:rPr>
                 <w:rStyle w:val="CommentTok"/>
               </w:rPr>
-              <w:t xml:space="preserve">#&gt;  3 age                         -0.0436 -0.149 </w:t>
+              <w:t xml:space="preserve">#&gt;  3 age                         -0.0436 -0.0729</w:t>
             </w:r>
             <w:r>
               <w:br/>
@@ -34040,7 +34040,7 @@
               <w:rPr>
                 <w:rStyle w:val="CommentTok"/>
               </w:rPr>
-              <w:t xml:space="preserve">#&gt;  4 sexF                         0.884   0.220 </w:t>
+              <w:t xml:space="preserve">#&gt;  4 sexF                         0.884  -0.555 </w:t>
             </w:r>
             <w:r>
               <w:br/>
@@ -34049,7 +34049,7 @@
               <w:rPr>
                 <w:rStyle w:val="CommentTok"/>
               </w:rPr>
-              <w:t xml:space="preserve">#&gt;  5 ethnAA                       0.953   1.60  </w:t>
+              <w:t xml:space="preserve">#&gt;  5 ethnAA                       0.953   0.910 </w:t>
             </w:r>
             <w:r>
               <w:br/>
@@ -34058,7 +34058,7 @@
               <w:rPr>
                 <w:rStyle w:val="CommentTok"/>
               </w:rPr>
-              <w:t xml:space="preserve">#&gt;  6 ethnHispanic                 0.578   3.78  </w:t>
+              <w:t xml:space="preserve">#&gt;  6 ethnHispanic                 0.578   2.62  </w:t>
             </w:r>
             <w:r>
               <w:br/>
@@ -34067,7 +34067,7 @@
               <w:rPr>
                 <w:rStyle w:val="CommentTok"/>
               </w:rPr>
-              <w:t xml:space="preserve">#&gt;  7 ethnOther                    0.0360 -3.24  </w:t>
+              <w:t xml:space="preserve">#&gt;  7 ethnOther                    0.0360 -1.60  </w:t>
             </w:r>
             <w:r>
               <w:br/>
@@ -34076,7 +34076,7 @@
               <w:rPr>
                 <w:rStyle w:val="CommentTok"/>
               </w:rPr>
-              <w:t xml:space="preserve">#&gt;  8 polydrugmultiple drugs used -1.68   -4.05  </w:t>
+              <w:t xml:space="preserve">#&gt;  8 polydrugmultiple drugs used -1.68   -3.71  </w:t>
             </w:r>
             <w:r>
               <w:br/>
@@ -34085,7 +34085,7 @@
               <w:rPr>
                 <w:rStyle w:val="CommentTok"/>
               </w:rPr>
-              <w:t xml:space="preserve">#&gt;  9 hivstatHIV+                 -2.18   -1.15  </w:t>
+              <w:t xml:space="preserve">#&gt;  9 hivstatHIV+                 -2.18   -3.48  </w:t>
             </w:r>
             <w:r>
               <w:br/>
@@ -34094,7 +34094,7 @@
               <w:rPr>
                 <w:rStyle w:val="CommentTok"/>
               </w:rPr>
-              <w:t xml:space="preserve">#&gt; 10 sexabuseyes                 -1.47   -2.64  </w:t>
+              <w:t xml:space="preserve">#&gt; 10 sexabuseyes                 -1.47   -1.56  </w:t>
             </w:r>
             <w:r>
               <w:br/>
@@ -34103,7 +34103,7 @@
               <w:rPr>
                 <w:rStyle w:val="CommentTok"/>
               </w:rPr>
-              <w:t xml:space="preserve">#&gt; 11 hplsns                      -0.0315  0.0948</w:t>
+              <w:t xml:space="preserve">#&gt; 11 hplsns                      -0.0315 -0.0449</w:t>
             </w:r>
           </w:p>
           <w:bookmarkEnd w:id="88"/>

</xml_diff>

<commit_message>
Deploying to gh-pages from @ d-morrison/rme@21ef3229eab8670793efcb9b4493a5c7da72285e 🚀
</commit_message>
<xml_diff>
--- a/chapters/count-regression-handout.docx
+++ b/chapters/count-regression-handout.docx
@@ -33540,7 +33540,7 @@
               <w:rPr>
                 <w:rStyle w:val="CommentTok"/>
               </w:rPr>
-              <w:t xml:space="preserve">#&gt;     hivstat + sexabuse + hplsns, data = needles, init.theta = 0.0903642555, </w:t>
+              <w:t xml:space="preserve">#&gt;     hivstat + sexabuse + hplsns, data = needles, init.theta = 0.08315440712, </w:t>
             </w:r>
             <w:r>
               <w:br/>
@@ -33576,7 +33576,7 @@
               <w:rPr>
                 <w:rStyle w:val="CommentTok"/>
               </w:rPr>
-              <w:t xml:space="preserve">#&gt;                             Estimate Std. Error z value Pr(&gt;|z|)   </w:t>
+              <w:t xml:space="preserve">#&gt;                             Estimate Std. Error z value Pr(&gt;|z|)    </w:t>
             </w:r>
             <w:r>
               <w:br/>
@@ -33585,7 +33585,7 @@
               <w:rPr>
                 <w:rStyle w:val="CommentTok"/>
               </w:rPr>
-              <w:t xml:space="preserve">#&gt; (Intercept)                   2.8948     1.9293    1.50   0.1335   </w:t>
+              <w:t xml:space="preserve">#&gt; (Intercept)                   6.4536     1.8421    3.50  0.00046 ***</w:t>
             </w:r>
             <w:r>
               <w:br/>
@@ -33594,7 +33594,7 @@
               <w:rPr>
                 <w:rStyle w:val="CommentTok"/>
               </w:rPr>
-              <w:t xml:space="preserve">#&gt; homelesshomeless              2.5534     0.8024    3.18   0.0015 **</w:t>
+              <w:t xml:space="preserve">#&gt; homelesshomeless              1.1508     0.7366    1.56  0.11820    </w:t>
             </w:r>
             <w:r>
               <w:br/>
@@ -33603,7 +33603,7 @@
               <w:rPr>
                 <w:rStyle w:val="CommentTok"/>
               </w:rPr>
-              <w:t xml:space="preserve">#&gt; age                          -0.0729     0.0447   -1.63   0.1027   </w:t>
+              <w:t xml:space="preserve">#&gt; age                          -0.1485     0.0433   -3.43  0.00059 ***</w:t>
             </w:r>
             <w:r>
               <w:br/>
@@ -33612,7 +33612,7 @@
               <w:rPr>
                 <w:rStyle w:val="CommentTok"/>
               </w:rPr>
-              <w:t xml:space="preserve">#&gt; sexF                         -0.5545     0.8869   -0.63   0.5318   </w:t>
+              <w:t xml:space="preserve">#&gt; sexF                          0.2198     0.8179    0.27  0.78813    </w:t>
             </w:r>
             <w:r>
               <w:br/>
@@ -33621,7 +33621,7 @@
               <w:rPr>
                 <w:rStyle w:val="CommentTok"/>
               </w:rPr>
-              <w:t xml:space="preserve">#&gt; ethnAA                        0.9100     0.9416    0.97   0.3339   </w:t>
+              <w:t xml:space="preserve">#&gt; ethnAA                        1.5958     0.8890    1.79  0.07265 .  </w:t>
             </w:r>
             <w:r>
               <w:br/>
@@ -33630,7 +33630,7 @@
               <w:rPr>
                 <w:rStyle w:val="CommentTok"/>
               </w:rPr>
-              <w:t xml:space="preserve">#&gt; ethnHispanic                  2.6222     1.5835    1.66   0.0977 . </w:t>
+              <w:t xml:space="preserve">#&gt; ethnHispanic                  3.7763     1.5240    2.48  0.01322 *  </w:t>
             </w:r>
             <w:r>
               <w:br/>
@@ -33639,7 +33639,7 @@
               <w:rPr>
                 <w:rStyle w:val="CommentTok"/>
               </w:rPr>
-              <w:t xml:space="preserve">#&gt; ethnOther                    -1.5963     2.1745   -0.73   0.4629   </w:t>
+              <w:t xml:space="preserve">#&gt; ethnOther                    -3.2365     2.2663   -1.43  0.15327    </w:t>
             </w:r>
             <w:r>
               <w:br/>
@@ -33648,7 +33648,7 @@
               <w:rPr>
                 <w:rStyle w:val="CommentTok"/>
               </w:rPr>
-              <w:t xml:space="preserve">#&gt; polydrugmultiple drugs used  -3.7062     1.3330   -2.78   0.0054 **</w:t>
+              <w:t xml:space="preserve">#&gt; polydrugmultiple drugs used  -4.0532     1.0898   -3.72  0.00020 ***</w:t>
             </w:r>
             <w:r>
               <w:br/>
@@ -33657,7 +33657,7 @@
               <w:rPr>
                 <w:rStyle w:val="CommentTok"/>
               </w:rPr>
-              <w:t xml:space="preserve">#&gt; hivstatHIV+                  -3.4809     1.5036   -2.32   0.0206 * </w:t>
+              <w:t xml:space="preserve">#&gt; hivstatHIV+                  -1.1548     1.3185   -0.88  0.38113    </w:t>
             </w:r>
             <w:r>
               <w:br/>
@@ -33666,7 +33666,7 @@
               <w:rPr>
                 <w:rStyle w:val="CommentTok"/>
               </w:rPr>
-              <w:t xml:space="preserve">#&gt; sexabuseyes                  -1.5612     1.2484   -1.25   0.2111   </w:t>
+              <w:t xml:space="preserve">#&gt; sexabuseyes                  -2.6449     1.0772   -2.46  0.01408 *  </w:t>
             </w:r>
             <w:r>
               <w:br/>
@@ -33675,7 +33675,7 @@
               <w:rPr>
                 <w:rStyle w:val="CommentTok"/>
               </w:rPr>
-              <w:t xml:space="preserve">#&gt; hplsns                       -0.0449     0.0685   -0.66   0.5119   </w:t>
+              <w:t xml:space="preserve">#&gt; hplsns                        0.0948     0.0648    1.46  0.14306    </w:t>
             </w:r>
             <w:r>
               <w:br/>
@@ -33711,7 +33711,7 @@
               <w:rPr>
                 <w:rStyle w:val="CommentTok"/>
               </w:rPr>
-              <w:t xml:space="preserve">#&gt; (Dispersion parameter for Negative Binomial(0.0899) family taken to be 1)</w:t>
+              <w:t xml:space="preserve">#&gt; (Dispersion parameter for Negative Binomial(0.0913) family taken to be 1)</w:t>
             </w:r>
             <w:r>
               <w:br/>
@@ -33729,7 +33729,7 @@
               <w:rPr>
                 <w:rStyle w:val="CommentTok"/>
               </w:rPr>
-              <w:t xml:space="preserve">#&gt;     Null deviance: 61.511  on 108  degrees of freedom</w:t>
+              <w:t xml:space="preserve">#&gt;     Null deviance: 62.231  on 108  degrees of freedom</w:t>
             </w:r>
             <w:r>
               <w:br/>
@@ -33738,7 +33738,7 @@
               <w:rPr>
                 <w:rStyle w:val="CommentTok"/>
               </w:rPr>
-              <w:t xml:space="preserve">#&gt; Residual deviance: 52.284  on  98  degrees of freedom</w:t>
+              <w:t xml:space="preserve">#&gt; Residual deviance: 60.031  on  98  degrees of freedom</w:t>
             </w:r>
             <w:r>
               <w:br/>
@@ -33756,7 +33756,7 @@
               <w:rPr>
                 <w:rStyle w:val="CommentTok"/>
               </w:rPr>
-              <w:t xml:space="preserve">#&gt; AIC: 261.5</w:t>
+              <w:t xml:space="preserve">#&gt; AIC: 267.9</w:t>
             </w:r>
             <w:r>
               <w:br/>
@@ -33801,7 +33801,7 @@
               <w:rPr>
                 <w:rStyle w:val="CommentTok"/>
               </w:rPr>
-              <w:t xml:space="preserve">#&gt;               Theta:  0.0904 </w:t>
+              <w:t xml:space="preserve">#&gt;               Theta:  0.0832 </w:t>
             </w:r>
             <w:r>
               <w:br/>
@@ -33810,7 +33810,7 @@
               <w:rPr>
                 <w:rStyle w:val="CommentTok"/>
               </w:rPr>
-              <w:t xml:space="preserve">#&gt;           Std. Err.:  0.0239 </w:t>
+              <w:t xml:space="preserve">#&gt;           Std. Err.:  0.0216 </w:t>
             </w:r>
             <w:r>
               <w:br/>
@@ -33837,7 +33837,7 @@
               <w:rPr>
                 <w:rStyle w:val="CommentTok"/>
               </w:rPr>
-              <w:t xml:space="preserve">#&gt;  2 x log-likelihood:  -237.5430</w:t>
+              <w:t xml:space="preserve">#&gt;  2 x log-likelihood:  -243.8880</w:t>
             </w:r>
           </w:p>
           <w:bookmarkEnd w:id="87"/>
@@ -34013,7 +34013,7 @@
               <w:rPr>
                 <w:rStyle w:val="CommentTok"/>
               </w:rPr>
-              <w:t xml:space="preserve">#&gt;  1 (Intercept)                  1.31    2.89  </w:t>
+              <w:t xml:space="preserve">#&gt;  1 (Intercept)                  1.31    6.45  </w:t>
             </w:r>
             <w:r>
               <w:br/>
@@ -34022,7 +34022,7 @@
               <w:rPr>
                 <w:rStyle w:val="CommentTok"/>
               </w:rPr>
-              <w:t xml:space="preserve">#&gt;  2 homelesshomeless             1.80    2.55  </w:t>
+              <w:t xml:space="preserve">#&gt;  2 homelesshomeless             1.80    1.15  </w:t>
             </w:r>
             <w:r>
               <w:br/>
@@ -34031,7 +34031,7 @@
               <w:rPr>
                 <w:rStyle w:val="CommentTok"/>
               </w:rPr>
-              <w:t xml:space="preserve">#&gt;  3 age                         -0.0436 -0.0729</w:t>
+              <w:t xml:space="preserve">#&gt;  3 age                         -0.0436 -0.149 </w:t>
             </w:r>
             <w:r>
               <w:br/>
@@ -34040,7 +34040,7 @@
               <w:rPr>
                 <w:rStyle w:val="CommentTok"/>
               </w:rPr>
-              <w:t xml:space="preserve">#&gt;  4 sexF                         0.884  -0.555 </w:t>
+              <w:t xml:space="preserve">#&gt;  4 sexF                         0.884   0.220 </w:t>
             </w:r>
             <w:r>
               <w:br/>
@@ -34049,7 +34049,7 @@
               <w:rPr>
                 <w:rStyle w:val="CommentTok"/>
               </w:rPr>
-              <w:t xml:space="preserve">#&gt;  5 ethnAA                       0.953   0.910 </w:t>
+              <w:t xml:space="preserve">#&gt;  5 ethnAA                       0.953   1.60  </w:t>
             </w:r>
             <w:r>
               <w:br/>
@@ -34058,7 +34058,7 @@
               <w:rPr>
                 <w:rStyle w:val="CommentTok"/>
               </w:rPr>
-              <w:t xml:space="preserve">#&gt;  6 ethnHispanic                 0.578   2.62  </w:t>
+              <w:t xml:space="preserve">#&gt;  6 ethnHispanic                 0.578   3.78  </w:t>
             </w:r>
             <w:r>
               <w:br/>
@@ -34067,7 +34067,7 @@
               <w:rPr>
                 <w:rStyle w:val="CommentTok"/>
               </w:rPr>
-              <w:t xml:space="preserve">#&gt;  7 ethnOther                    0.0360 -1.60  </w:t>
+              <w:t xml:space="preserve">#&gt;  7 ethnOther                    0.0360 -3.24  </w:t>
             </w:r>
             <w:r>
               <w:br/>
@@ -34076,7 +34076,7 @@
               <w:rPr>
                 <w:rStyle w:val="CommentTok"/>
               </w:rPr>
-              <w:t xml:space="preserve">#&gt;  8 polydrugmultiple drugs used -1.68   -3.71  </w:t>
+              <w:t xml:space="preserve">#&gt;  8 polydrugmultiple drugs used -1.68   -4.05  </w:t>
             </w:r>
             <w:r>
               <w:br/>
@@ -34085,7 +34085,7 @@
               <w:rPr>
                 <w:rStyle w:val="CommentTok"/>
               </w:rPr>
-              <w:t xml:space="preserve">#&gt;  9 hivstatHIV+                 -2.18   -3.48  </w:t>
+              <w:t xml:space="preserve">#&gt;  9 hivstatHIV+                 -2.18   -1.15  </w:t>
             </w:r>
             <w:r>
               <w:br/>
@@ -34094,7 +34094,7 @@
               <w:rPr>
                 <w:rStyle w:val="CommentTok"/>
               </w:rPr>
-              <w:t xml:space="preserve">#&gt; 10 sexabuseyes                 -1.47   -1.56  </w:t>
+              <w:t xml:space="preserve">#&gt; 10 sexabuseyes                 -1.47   -2.64  </w:t>
             </w:r>
             <w:r>
               <w:br/>
@@ -34103,7 +34103,7 @@
               <w:rPr>
                 <w:rStyle w:val="CommentTok"/>
               </w:rPr>
-              <w:t xml:space="preserve">#&gt; 11 hplsns                      -0.0315 -0.0449</w:t>
+              <w:t xml:space="preserve">#&gt; 11 hplsns                      -0.0315  0.0948</w:t>
             </w:r>
           </w:p>
           <w:bookmarkEnd w:id="88"/>

</xml_diff>

<commit_message>
Deploying to gh-pages from @ d-morrison/rme@7b8af75b3c2155f81885c738a7860f5f2df14221 🚀
</commit_message>
<xml_diff>
--- a/chapters/count-regression-handout.docx
+++ b/chapters/count-regression-handout.docx
@@ -33540,7 +33540,7 @@
               <w:rPr>
                 <w:rStyle w:val="CommentTok"/>
               </w:rPr>
-              <w:t xml:space="preserve">#&gt;     hivstat + sexabuse + hplsns, data = needles, init.theta = 0.08315440712, </w:t>
+              <w:t xml:space="preserve">#&gt;     hivstat + sexabuse + hplsns, data = needles, init.theta = 0.0903642555, </w:t>
             </w:r>
             <w:r>
               <w:br/>
@@ -33576,7 +33576,7 @@
               <w:rPr>
                 <w:rStyle w:val="CommentTok"/>
               </w:rPr>
-              <w:t xml:space="preserve">#&gt;                             Estimate Std. Error z value Pr(&gt;|z|)    </w:t>
+              <w:t xml:space="preserve">#&gt;                             Estimate Std. Error z value Pr(&gt;|z|)   </w:t>
             </w:r>
             <w:r>
               <w:br/>
@@ -33585,7 +33585,7 @@
               <w:rPr>
                 <w:rStyle w:val="CommentTok"/>
               </w:rPr>
-              <w:t xml:space="preserve">#&gt; (Intercept)                   6.4536     1.8421    3.50  0.00046 ***</w:t>
+              <w:t xml:space="preserve">#&gt; (Intercept)                   2.8948     1.9293    1.50   0.1335   </w:t>
             </w:r>
             <w:r>
               <w:br/>
@@ -33594,7 +33594,7 @@
               <w:rPr>
                 <w:rStyle w:val="CommentTok"/>
               </w:rPr>
-              <w:t xml:space="preserve">#&gt; homelesshomeless              1.1508     0.7366    1.56  0.11820    </w:t>
+              <w:t xml:space="preserve">#&gt; homelesshomeless              2.5534     0.8024    3.18   0.0015 **</w:t>
             </w:r>
             <w:r>
               <w:br/>
@@ -33603,7 +33603,7 @@
               <w:rPr>
                 <w:rStyle w:val="CommentTok"/>
               </w:rPr>
-              <w:t xml:space="preserve">#&gt; age                          -0.1485     0.0433   -3.43  0.00059 ***</w:t>
+              <w:t xml:space="preserve">#&gt; age                          -0.0729     0.0447   -1.63   0.1027   </w:t>
             </w:r>
             <w:r>
               <w:br/>
@@ -33612,7 +33612,7 @@
               <w:rPr>
                 <w:rStyle w:val="CommentTok"/>
               </w:rPr>
-              <w:t xml:space="preserve">#&gt; sexF                          0.2198     0.8179    0.27  0.78813    </w:t>
+              <w:t xml:space="preserve">#&gt; sexF                         -0.5545     0.8869   -0.63   0.5318   </w:t>
             </w:r>
             <w:r>
               <w:br/>
@@ -33621,7 +33621,7 @@
               <w:rPr>
                 <w:rStyle w:val="CommentTok"/>
               </w:rPr>
-              <w:t xml:space="preserve">#&gt; ethnAA                        1.5958     0.8890    1.79  0.07265 .  </w:t>
+              <w:t xml:space="preserve">#&gt; ethnAA                        0.9100     0.9416    0.97   0.3339   </w:t>
             </w:r>
             <w:r>
               <w:br/>
@@ -33630,7 +33630,7 @@
               <w:rPr>
                 <w:rStyle w:val="CommentTok"/>
               </w:rPr>
-              <w:t xml:space="preserve">#&gt; ethnHispanic                  3.7763     1.5240    2.48  0.01322 *  </w:t>
+              <w:t xml:space="preserve">#&gt; ethnHispanic                  2.6222     1.5835    1.66   0.0977 . </w:t>
             </w:r>
             <w:r>
               <w:br/>
@@ -33639,7 +33639,7 @@
               <w:rPr>
                 <w:rStyle w:val="CommentTok"/>
               </w:rPr>
-              <w:t xml:space="preserve">#&gt; ethnOther                    -3.2365     2.2663   -1.43  0.15327    </w:t>
+              <w:t xml:space="preserve">#&gt; ethnOther                    -1.5963     2.1745   -0.73   0.4629   </w:t>
             </w:r>
             <w:r>
               <w:br/>
@@ -33648,7 +33648,7 @@
               <w:rPr>
                 <w:rStyle w:val="CommentTok"/>
               </w:rPr>
-              <w:t xml:space="preserve">#&gt; polydrugmultiple drugs used  -4.0532     1.0898   -3.72  0.00020 ***</w:t>
+              <w:t xml:space="preserve">#&gt; polydrugmultiple drugs used  -3.7062     1.3330   -2.78   0.0054 **</w:t>
             </w:r>
             <w:r>
               <w:br/>
@@ -33657,7 +33657,7 @@
               <w:rPr>
                 <w:rStyle w:val="CommentTok"/>
               </w:rPr>
-              <w:t xml:space="preserve">#&gt; hivstatHIV+                  -1.1548     1.3185   -0.88  0.38113    </w:t>
+              <w:t xml:space="preserve">#&gt; hivstatHIV+                  -3.4809     1.5036   -2.32   0.0206 * </w:t>
             </w:r>
             <w:r>
               <w:br/>
@@ -33666,7 +33666,7 @@
               <w:rPr>
                 <w:rStyle w:val="CommentTok"/>
               </w:rPr>
-              <w:t xml:space="preserve">#&gt; sexabuseyes                  -2.6449     1.0772   -2.46  0.01408 *  </w:t>
+              <w:t xml:space="preserve">#&gt; sexabuseyes                  -1.5612     1.2484   -1.25   0.2111   </w:t>
             </w:r>
             <w:r>
               <w:br/>
@@ -33675,7 +33675,7 @@
               <w:rPr>
                 <w:rStyle w:val="CommentTok"/>
               </w:rPr>
-              <w:t xml:space="preserve">#&gt; hplsns                        0.0948     0.0648    1.46  0.14306    </w:t>
+              <w:t xml:space="preserve">#&gt; hplsns                       -0.0449     0.0685   -0.66   0.5119   </w:t>
             </w:r>
             <w:r>
               <w:br/>
@@ -33711,7 +33711,7 @@
               <w:rPr>
                 <w:rStyle w:val="CommentTok"/>
               </w:rPr>
-              <w:t xml:space="preserve">#&gt; (Dispersion parameter for Negative Binomial(0.0913) family taken to be 1)</w:t>
+              <w:t xml:space="preserve">#&gt; (Dispersion parameter for Negative Binomial(0.0899) family taken to be 1)</w:t>
             </w:r>
             <w:r>
               <w:br/>
@@ -33729,7 +33729,7 @@
               <w:rPr>
                 <w:rStyle w:val="CommentTok"/>
               </w:rPr>
-              <w:t xml:space="preserve">#&gt;     Null deviance: 62.231  on 108  degrees of freedom</w:t>
+              <w:t xml:space="preserve">#&gt;     Null deviance: 61.511  on 108  degrees of freedom</w:t>
             </w:r>
             <w:r>
               <w:br/>
@@ -33738,7 +33738,7 @@
               <w:rPr>
                 <w:rStyle w:val="CommentTok"/>
               </w:rPr>
-              <w:t xml:space="preserve">#&gt; Residual deviance: 60.031  on  98  degrees of freedom</w:t>
+              <w:t xml:space="preserve">#&gt; Residual deviance: 52.284  on  98  degrees of freedom</w:t>
             </w:r>
             <w:r>
               <w:br/>
@@ -33756,7 +33756,7 @@
               <w:rPr>
                 <w:rStyle w:val="CommentTok"/>
               </w:rPr>
-              <w:t xml:space="preserve">#&gt; AIC: 267.9</w:t>
+              <w:t xml:space="preserve">#&gt; AIC: 261.5</w:t>
             </w:r>
             <w:r>
               <w:br/>
@@ -33801,7 +33801,7 @@
               <w:rPr>
                 <w:rStyle w:val="CommentTok"/>
               </w:rPr>
-              <w:t xml:space="preserve">#&gt;               Theta:  0.0832 </w:t>
+              <w:t xml:space="preserve">#&gt;               Theta:  0.0904 </w:t>
             </w:r>
             <w:r>
               <w:br/>
@@ -33810,7 +33810,7 @@
               <w:rPr>
                 <w:rStyle w:val="CommentTok"/>
               </w:rPr>
-              <w:t xml:space="preserve">#&gt;           Std. Err.:  0.0216 </w:t>
+              <w:t xml:space="preserve">#&gt;           Std. Err.:  0.0239 </w:t>
             </w:r>
             <w:r>
               <w:br/>
@@ -33837,7 +33837,7 @@
               <w:rPr>
                 <w:rStyle w:val="CommentTok"/>
               </w:rPr>
-              <w:t xml:space="preserve">#&gt;  2 x log-likelihood:  -243.8880</w:t>
+              <w:t xml:space="preserve">#&gt;  2 x log-likelihood:  -237.5430</w:t>
             </w:r>
           </w:p>
           <w:bookmarkEnd w:id="87"/>
@@ -34013,7 +34013,7 @@
               <w:rPr>
                 <w:rStyle w:val="CommentTok"/>
               </w:rPr>
-              <w:t xml:space="preserve">#&gt;  1 (Intercept)                  1.31    6.45  </w:t>
+              <w:t xml:space="preserve">#&gt;  1 (Intercept)                  1.31    2.89  </w:t>
             </w:r>
             <w:r>
               <w:br/>
@@ -34022,7 +34022,7 @@
               <w:rPr>
                 <w:rStyle w:val="CommentTok"/>
               </w:rPr>
-              <w:t xml:space="preserve">#&gt;  2 homelesshomeless             1.80    1.15  </w:t>
+              <w:t xml:space="preserve">#&gt;  2 homelesshomeless             1.80    2.55  </w:t>
             </w:r>
             <w:r>
               <w:br/>
@@ -34031,7 +34031,7 @@
               <w:rPr>
                 <w:rStyle w:val="CommentTok"/>
               </w:rPr>
-              <w:t xml:space="preserve">#&gt;  3 age                         -0.0436 -0.149 </w:t>
+              <w:t xml:space="preserve">#&gt;  3 age                         -0.0436 -0.0729</w:t>
             </w:r>
             <w:r>
               <w:br/>
@@ -34040,7 +34040,7 @@
               <w:rPr>
                 <w:rStyle w:val="CommentTok"/>
               </w:rPr>
-              <w:t xml:space="preserve">#&gt;  4 sexF                         0.884   0.220 </w:t>
+              <w:t xml:space="preserve">#&gt;  4 sexF                         0.884  -0.555 </w:t>
             </w:r>
             <w:r>
               <w:br/>
@@ -34049,7 +34049,7 @@
               <w:rPr>
                 <w:rStyle w:val="CommentTok"/>
               </w:rPr>
-              <w:t xml:space="preserve">#&gt;  5 ethnAA                       0.953   1.60  </w:t>
+              <w:t xml:space="preserve">#&gt;  5 ethnAA                       0.953   0.910 </w:t>
             </w:r>
             <w:r>
               <w:br/>
@@ -34058,7 +34058,7 @@
               <w:rPr>
                 <w:rStyle w:val="CommentTok"/>
               </w:rPr>
-              <w:t xml:space="preserve">#&gt;  6 ethnHispanic                 0.578   3.78  </w:t>
+              <w:t xml:space="preserve">#&gt;  6 ethnHispanic                 0.578   2.62  </w:t>
             </w:r>
             <w:r>
               <w:br/>
@@ -34067,7 +34067,7 @@
               <w:rPr>
                 <w:rStyle w:val="CommentTok"/>
               </w:rPr>
-              <w:t xml:space="preserve">#&gt;  7 ethnOther                    0.0360 -3.24  </w:t>
+              <w:t xml:space="preserve">#&gt;  7 ethnOther                    0.0360 -1.60  </w:t>
             </w:r>
             <w:r>
               <w:br/>
@@ -34076,7 +34076,7 @@
               <w:rPr>
                 <w:rStyle w:val="CommentTok"/>
               </w:rPr>
-              <w:t xml:space="preserve">#&gt;  8 polydrugmultiple drugs used -1.68   -4.05  </w:t>
+              <w:t xml:space="preserve">#&gt;  8 polydrugmultiple drugs used -1.68   -3.71  </w:t>
             </w:r>
             <w:r>
               <w:br/>
@@ -34085,7 +34085,7 @@
               <w:rPr>
                 <w:rStyle w:val="CommentTok"/>
               </w:rPr>
-              <w:t xml:space="preserve">#&gt;  9 hivstatHIV+                 -2.18   -1.15  </w:t>
+              <w:t xml:space="preserve">#&gt;  9 hivstatHIV+                 -2.18   -3.48  </w:t>
             </w:r>
             <w:r>
               <w:br/>
@@ -34094,7 +34094,7 @@
               <w:rPr>
                 <w:rStyle w:val="CommentTok"/>
               </w:rPr>
-              <w:t xml:space="preserve">#&gt; 10 sexabuseyes                 -1.47   -2.64  </w:t>
+              <w:t xml:space="preserve">#&gt; 10 sexabuseyes                 -1.47   -1.56  </w:t>
             </w:r>
             <w:r>
               <w:br/>
@@ -34103,7 +34103,7 @@
               <w:rPr>
                 <w:rStyle w:val="CommentTok"/>
               </w:rPr>
-              <w:t xml:space="preserve">#&gt; 11 hplsns                      -0.0315  0.0948</w:t>
+              <w:t xml:space="preserve">#&gt; 11 hplsns                      -0.0315 -0.0449</w:t>
             </w:r>
           </w:p>
           <w:bookmarkEnd w:id="88"/>

</xml_diff>

<commit_message>
Deploying to gh-pages from @ d-morrison/rme@84b3b7e4a0cf163d9e69bf3d83241cea21477bd8 🚀
</commit_message>
<xml_diff>
--- a/chapters/count-regression-handout.docx
+++ b/chapters/count-regression-handout.docx
@@ -4178,7 +4178,7 @@
         <w:pStyle w:val="BodyText"/>
       </w:pPr>
       <w:r>
-        <w:t xml:space="preserve">That is, letting</w:t>
+        <w:t xml:space="preserve">Specifically, letting</w:t>
       </w:r>
       <w:r>
         <w:t xml:space="preserve"> </w:t>
@@ -42354,7 +42354,7 @@
               <w:t xml:space="preserve"> </w:t>
             </w:r>
             <w:r>
-              <w:t xml:space="preserve">This is the GLM analogue of the OLS normal equations.</w:t>
+              <w:t xml:space="preserve">This system of equations is the GLM analogue of the OLS normal equations.</w:t>
             </w:r>
           </w:p>
           <w:p/>

</xml_diff>